<commit_message>
fix: fixes resume 2
</commit_message>
<xml_diff>
--- a/src/assets/Samil_Abud_Resume_2026.docx
+++ b/src/assets/Samil_Abud_Resume_2026.docx
@@ -140,7 +140,7 @@
         <w:t>AI/LLM-powered products</w:t>
       </w:r>
       <w:r>
-        <w:t xml:space="preserve">, integrating the Anthropic Claude API into OCR and document-processing pipelines — and independently architecting full-stack platforms from database to deployment, including authentication, real-time messaging, and payments. Adept at leading cross-functional teams, mentoring junior developers, and collaborating with stakeholders to exceed project goals.</w:t>
+        <w:t xml:space="preserve">, integrating the Anthropic Claude API into vision-based document-processing pipelines — and independently architecting full-stack platforms from database to deployment, including authentication, real-time messaging, and payments. Adept at leading cross-functional teams, mentoring junior developers, and collaborating with stakeholders to exceed project goals.</w:t>
       </w:r>
     </w:p>
     <w:p>
@@ -206,7 +206,7 @@
         <w:rPr>
           <w:sz w:val="21"/>
         </w:rPr>
-        <w:t>Anthropic Claude API, LLM integration, OCR &amp; document data extraction, prompt engineering, AI-assisted / agent-driven development</w:t>
+        <w:t>Anthropic Claude API, LLM integration, vision-based document data extraction, prompt engineering, AI-assisted / agent-driven development</w:t>
       </w:r>
     </w:p>
     <w:p>
@@ -327,7 +327,7 @@
         <w:rPr>
           <w:sz w:val="21"/>
         </w:rPr>
-        <w:t>Engineered a production, multi-tenant platform spanning physician, enterprise, and admin portals plus an OCR microservice — built with Next.js 14, TypeScript, Prisma/PostgreSQL (multi-schema), and AWS (CDK/EKS).</w:t>
+        <w:t>Engineered a production, multi-tenant platform spanning physician, enterprise, and admin portals plus a document-processing microservice — built with Next.js 14, TypeScript, Prisma/PostgreSQL (multi-schema), and AWS (CDK/EKS).</w:t>
       </w:r>
     </w:p>
     <w:p>
@@ -351,7 +351,7 @@
         <w:rPr>
           <w:sz w:val="21"/>
         </w:rPr>
-        <w:t xml:space="preserve">: a Python/Django OCR service extracts structured fields (license numbers, names, dates) from documents, then the Claude API structures the data, with prompt variants per document type. Fixed real bugs: hidden PDF text layers leaking into AI prompts, and nested JSON breaking the physician edit round-trip.</w:t>
+        <w:t xml:space="preserve">: a Python/Django service preprocesses documents (page splitting, image prep), then Claude’s vision capability extracts structured fields (license numbers, names, dates) directly from the images, with prompt variants per document type. Fixed real bugs: added a fallback that cross-checks the PDF’s embedded text layer when extraction fails format validation, raising accuracy on affected credential types from ~70% to ~100%, and fixed nested JSON breaking the physician edit round-trip.</w:t>
       </w:r>
     </w:p>
     <w:p>

</xml_diff>